<commit_message>
A lot of AI fixes that I lost track of.
</commit_message>
<xml_diff>
--- a/templates/certificate_template.docx
+++ b/templates/certificate_template.docx
@@ -23,10 +23,10 @@
               <w:end w:w="145" w:type="dxa"/>
             </w:tcMar>
             <w:tcBorders>
-              <w:top w:val="single" w:sz="7" w:color="2A2D30"/>
-              <w:bottom w:val="single" w:sz="7" w:color="2A2D30"/>
-              <w:start w:val="single" w:sz="7" w:color="2A2D30"/>
-              <w:end w:val="single" w:sz="7" w:color="2A2D30"/>
+              <w:top w:val="single" w:sz="3" w:color="C4C9CE"/>
+              <w:bottom w:val="single" w:sz="3" w:color="C4C9CE"/>
+              <w:start w:val="single" w:sz="3" w:color="C4C9CE"/>
+              <w:end w:val="single" w:sz="3" w:color="C4C9CE"/>
             </w:tcBorders>
           </w:tcPr>
           <w:tbl>
@@ -419,9 +419,6 @@
                   <w:pPr>
                     <w:spacing w:before="60" w:after="0"/>
                     <w:jc w:val="center"/>
-                    <w:pBdr>
-                      <w:bottom w:val="single" w:sz="6" w:space="2" w:color="70767B"/>
-                    </w:pBdr>
                   </w:pPr>
                   <w:r>
                     <w:rPr>
@@ -499,9 +496,6 @@
                   <w:pPr>
                     <w:spacing w:before="60" w:after="0"/>
                     <w:jc w:val="center"/>
-                    <w:pBdr>
-                      <w:bottom w:val="single" w:sz="6" w:space="2" w:color="70767B"/>
-                    </w:pBdr>
                   </w:pPr>
                   <w:r>
                     <w:rPr>
@@ -581,9 +575,6 @@
                   <w:pPr>
                     <w:spacing w:before="60" w:after="0"/>
                     <w:jc w:val="center"/>
-                    <w:pBdr>
-                      <w:bottom w:val="single" w:sz="6" w:space="2" w:color="70767B"/>
-                    </w:pBdr>
                   </w:pPr>
                   <w:r>
                     <w:rPr>
@@ -661,9 +652,6 @@
                   <w:pPr>
                     <w:spacing w:before="60" w:after="0"/>
                     <w:jc w:val="center"/>
-                    <w:pBdr>
-                      <w:bottom w:val="single" w:sz="6" w:space="2" w:color="70767B"/>
-                    </w:pBdr>
                   </w:pPr>
                   <w:r>
                     <w:rPr>

</xml_diff>